<commit_message>
Correct Moussa Kassim Mohamed author name
</commit_message>
<xml_diff>
--- a/deliverables/CellPhenotyper_Supplementary_Information_20260922_v2.docx
+++ b/deliverables/CellPhenotyper_Supplementary_Information_20260922_v2.docx
@@ -25,6 +25,281 @@
           <w:sz w:val="22"/>
         </w:rPr>
         <w:t>CellPhenotyper: an auditable, resolution-aware workflow for spatial analysis of H&amp;E whole-slide images</w:t>
+      </w:r>
+    </w:p>
+    <w:p>
+      <w:pPr>
+        <w:spacing w:after="180"/>
+      </w:pPr>
+      <w:r>
+        <w:rPr>
+          <w:rFonts w:ascii="Calibri" w:hAnsi="Calibri" w:eastAsia="Calibri"/>
+          <w:b/>
+          <w:color w:val="1F2937"/>
+          <w:sz w:val="20"/>
+        </w:rPr>
+        <w:t>Martin Ocharo</w:t>
+      </w:r>
+      <w:r>
+        <w:rPr>
+          <w:rFonts w:ascii="Calibri" w:hAnsi="Calibri" w:eastAsia="Calibri"/>
+          <w:color w:val="1F2937"/>
+          <w:sz w:val="15"/>
+          <w:vertAlign w:val="superscript"/>
+        </w:rPr>
+        <w:t>1,2</w:t>
+      </w:r>
+      <w:r>
+        <w:t xml:space="preserve">, </w:t>
+      </w:r>
+      <w:r>
+        <w:rPr>
+          <w:rFonts w:ascii="Calibri" w:hAnsi="Calibri" w:eastAsia="Calibri"/>
+          <w:b/>
+          <w:color w:val="1F2937"/>
+          <w:sz w:val="20"/>
+        </w:rPr>
+        <w:t>Moussa Kassim Mohamed</w:t>
+      </w:r>
+      <w:r>
+        <w:rPr>
+          <w:rFonts w:ascii="Calibri" w:hAnsi="Calibri" w:eastAsia="Calibri"/>
+          <w:color w:val="1F2937"/>
+          <w:sz w:val="15"/>
+          <w:vertAlign w:val="superscript"/>
+        </w:rPr>
+        <w:t>1,2</w:t>
+      </w:r>
+      <w:r>
+        <w:t xml:space="preserve">, </w:t>
+      </w:r>
+      <w:r>
+        <w:rPr>
+          <w:rFonts w:ascii="Calibri" w:hAnsi="Calibri" w:eastAsia="Calibri"/>
+          <w:b/>
+          <w:color w:val="1F2937"/>
+          <w:sz w:val="20"/>
+        </w:rPr>
+        <w:t>Dalia Ahmed</w:t>
+      </w:r>
+      <w:r>
+        <w:rPr>
+          <w:rFonts w:ascii="Calibri" w:hAnsi="Calibri" w:eastAsia="Calibri"/>
+          <w:color w:val="1F2937"/>
+          <w:sz w:val="15"/>
+          <w:vertAlign w:val="superscript"/>
+        </w:rPr>
+        <w:t>1,3</w:t>
+      </w:r>
+      <w:r>
+        <w:t xml:space="preserve">, </w:t>
+      </w:r>
+      <w:r>
+        <w:rPr>
+          <w:rFonts w:ascii="Calibri" w:hAnsi="Calibri" w:eastAsia="Calibri"/>
+          <w:b/>
+          <w:color w:val="1F2937"/>
+          <w:sz w:val="20"/>
+        </w:rPr>
+        <w:t>Alessia Vignoli</w:t>
+      </w:r>
+      <w:r>
+        <w:rPr>
+          <w:rFonts w:ascii="Calibri" w:hAnsi="Calibri" w:eastAsia="Calibri"/>
+          <w:color w:val="1F2937"/>
+          <w:sz w:val="15"/>
+          <w:vertAlign w:val="superscript"/>
+        </w:rPr>
+        <w:t>4,5</w:t>
+      </w:r>
+      <w:r>
+        <w:t xml:space="preserve">, </w:t>
+      </w:r>
+      <w:r>
+        <w:rPr>
+          <w:rFonts w:ascii="Calibri" w:hAnsi="Calibri" w:eastAsia="Calibri"/>
+          <w:b/>
+          <w:color w:val="1F2937"/>
+          <w:sz w:val="20"/>
+        </w:rPr>
+        <w:t>Aashish Kumar</w:t>
+      </w:r>
+      <w:r>
+        <w:rPr>
+          <w:rFonts w:ascii="Calibri" w:hAnsi="Calibri" w:eastAsia="Calibri"/>
+          <w:color w:val="1F2937"/>
+          <w:sz w:val="15"/>
+          <w:vertAlign w:val="superscript"/>
+        </w:rPr>
+        <w:t>6</w:t>
+      </w:r>
+      <w:r>
+        <w:t xml:space="preserve">, </w:t>
+      </w:r>
+      <w:r>
+        <w:rPr>
+          <w:rFonts w:ascii="Calibri" w:hAnsi="Calibri" w:eastAsia="Calibri"/>
+          <w:b/>
+          <w:color w:val="1F2937"/>
+          <w:sz w:val="20"/>
+        </w:rPr>
+        <w:t>Giulia Canarutto</w:t>
+      </w:r>
+      <w:r>
+        <w:rPr>
+          <w:rFonts w:ascii="Calibri" w:hAnsi="Calibri" w:eastAsia="Calibri"/>
+          <w:color w:val="1F2937"/>
+          <w:sz w:val="15"/>
+          <w:vertAlign w:val="superscript"/>
+        </w:rPr>
+        <w:t>7</w:t>
+      </w:r>
+      <w:r>
+        <w:t xml:space="preserve">, </w:t>
+      </w:r>
+      <w:r>
+        <w:rPr>
+          <w:rFonts w:ascii="Calibri" w:hAnsi="Calibri" w:eastAsia="Calibri"/>
+          <w:b/>
+          <w:color w:val="1F2937"/>
+          <w:sz w:val="20"/>
+        </w:rPr>
+        <w:t>Brendon Price</w:t>
+      </w:r>
+      <w:r>
+        <w:rPr>
+          <w:rFonts w:ascii="Calibri" w:hAnsi="Calibri" w:eastAsia="Calibri"/>
+          <w:color w:val="1F2937"/>
+          <w:sz w:val="15"/>
+          <w:vertAlign w:val="superscript"/>
+        </w:rPr>
+        <w:t>8</w:t>
+      </w:r>
+      <w:r>
+        <w:t xml:space="preserve">, </w:t>
+      </w:r>
+      <w:r>
+        <w:rPr>
+          <w:rFonts w:ascii="Calibri" w:hAnsi="Calibri" w:eastAsia="Calibri"/>
+          <w:b/>
+          <w:color w:val="1F2937"/>
+          <w:sz w:val="20"/>
+        </w:rPr>
+        <w:t>Shweta Sbirla</w:t>
+      </w:r>
+      <w:r>
+        <w:rPr>
+          <w:rFonts w:ascii="Calibri" w:hAnsi="Calibri" w:eastAsia="Calibri"/>
+          <w:color w:val="1F2937"/>
+          <w:sz w:val="15"/>
+          <w:vertAlign w:val="superscript"/>
+        </w:rPr>
+        <w:t>6</w:t>
+      </w:r>
+      <w:r>
+        <w:t xml:space="preserve">, </w:t>
+      </w:r>
+      <w:r>
+        <w:rPr>
+          <w:rFonts w:ascii="Calibri" w:hAnsi="Calibri" w:eastAsia="Calibri"/>
+          <w:b/>
+          <w:color w:val="1F2937"/>
+          <w:sz w:val="20"/>
+        </w:rPr>
+        <w:t>Leonardo Tenori</w:t>
+      </w:r>
+      <w:r>
+        <w:rPr>
+          <w:rFonts w:ascii="Calibri" w:hAnsi="Calibri" w:eastAsia="Calibri"/>
+          <w:color w:val="1F2937"/>
+          <w:sz w:val="15"/>
+          <w:vertAlign w:val="superscript"/>
+        </w:rPr>
+        <w:t>4,5</w:t>
+      </w:r>
+      <w:r>
+        <w:t xml:space="preserve">, </w:t>
+      </w:r>
+      <w:r>
+        <w:rPr>
+          <w:rFonts w:ascii="Calibri" w:hAnsi="Calibri" w:eastAsia="Calibri"/>
+          <w:b/>
+          <w:color w:val="1F2937"/>
+          <w:sz w:val="20"/>
+        </w:rPr>
+        <w:t>Silvano Piazza</w:t>
+      </w:r>
+      <w:r>
+        <w:rPr>
+          <w:rFonts w:ascii="Calibri" w:hAnsi="Calibri" w:eastAsia="Calibri"/>
+          <w:color w:val="1F2937"/>
+          <w:sz w:val="15"/>
+          <w:vertAlign w:val="superscript"/>
+        </w:rPr>
+        <w:t>7,9</w:t>
+      </w:r>
+      <w:r>
+        <w:t xml:space="preserve">, </w:t>
+      </w:r>
+      <w:r>
+        <w:rPr>
+          <w:rFonts w:ascii="Calibri" w:hAnsi="Calibri" w:eastAsia="Calibri"/>
+          <w:b/>
+          <w:color w:val="1F2937"/>
+          <w:sz w:val="20"/>
+        </w:rPr>
+        <w:t>Dinesh Gupta</w:t>
+      </w:r>
+      <w:r>
+        <w:rPr>
+          <w:rFonts w:ascii="Calibri" w:hAnsi="Calibri" w:eastAsia="Calibri"/>
+          <w:color w:val="1F2937"/>
+          <w:sz w:val="15"/>
+          <w:vertAlign w:val="superscript"/>
+        </w:rPr>
+        <w:t>6</w:t>
+      </w:r>
+      <w:r>
+        <w:t xml:space="preserve">, </w:t>
+      </w:r>
+      <w:r>
+        <w:rPr>
+          <w:rFonts w:ascii="Calibri" w:hAnsi="Calibri" w:eastAsia="Calibri"/>
+          <w:b/>
+          <w:color w:val="1F2937"/>
+          <w:sz w:val="20"/>
+        </w:rPr>
+        <w:t>Ekene Emmanuel Nweke</w:t>
+      </w:r>
+      <w:r>
+        <w:rPr>
+          <w:rFonts w:ascii="Calibri" w:hAnsi="Calibri" w:eastAsia="Calibri"/>
+          <w:color w:val="1F2937"/>
+          <w:sz w:val="15"/>
+          <w:vertAlign w:val="superscript"/>
+        </w:rPr>
+        <w:t>10</w:t>
+      </w:r>
+      <w:r>
+        <w:t xml:space="preserve">, </w:t>
+      </w:r>
+      <w:r>
+        <w:rPr>
+          <w:rFonts w:ascii="Calibri" w:hAnsi="Calibri" w:eastAsia="Calibri"/>
+          <w:b/>
+          <w:color w:val="1F2937"/>
+          <w:sz w:val="20"/>
+        </w:rPr>
+        <w:t>Stefano Cacciatore</w:t>
+      </w:r>
+      <w:r>
+        <w:rPr>
+          <w:rFonts w:ascii="Calibri" w:hAnsi="Calibri" w:eastAsia="Calibri"/>
+          <w:color w:val="1F2937"/>
+          <w:sz w:val="15"/>
+          <w:vertAlign w:val="superscript"/>
+        </w:rPr>
+        <w:t>1,2</w:t>
       </w:r>
     </w:p>
     <w:p>

</xml_diff>